<commit_message>
Update repository with August 14-15 SERS dataset, reports, and literature survey
</commit_message>
<xml_diff>
--- a/13-08-2026-raw-si/RawSi_Reference_Dataset_Report_13Aug2026.docx
+++ b/13-08-2026-raw-si/RawSi_Reference_Dataset_Report_13Aug2026.docx
@@ -2257,6 +2257,866 @@
         <w:t>Any candidate NAM or R6G peak that happens to fall near 517.8 cm⁻1 needs extra scrutiny, since bare Si alone can produce a strong signal right there.</w:t>
       </w:r>
     </w:p>
+    <w:p>
+      <w:r>
+        <w:br w:type="page"/>
+      </w:r>
+    </w:p>
+    <w:p>
+      <w:pPr>
+        <w:pStyle w:val="Heading1"/>
+      </w:pPr>
+      <w:r>
+        <w:t>5. Deeper Analysis</w:t>
+      </w:r>
+    </w:p>
+    <w:p>
+      <w:pPr>
+        <w:pStyle w:val="Heading2"/>
+      </w:pPr>
+      <w:r>
+        <w:t>5.1  Peak width (FWHM) — crystallinity check</w:t>
+      </w:r>
+    </w:p>
+    <w:p>
+      <w:pPr>
+        <w:spacing w:after="80"/>
+      </w:pPr>
+      <w:r>
+        <w:rPr>
+          <w:b w:val="0"/>
+          <w:i w:val="0"/>
+        </w:rPr>
+        <w:t>On the reference spectrum (P10/25s), the Si TO phonon has a full-width-at-half-maximum of ~7.2 cm⁻¹ (half-max crossings at 514.2 and 521.3 cm⁻¹). Textbook unstressed crystalline Si is usually narrower (~3-5 cm⁻¹), but this instrument's spectral sampling near 520 cm⁻¹ is only about 1.7 cm⁻¹/pixel (per the CSV header), so the peak is sampled by only ~4-5 points across its width — the simple threshold-crossing method used here is limited by that sampling, not necessarily reporting the true material linewidth. Treat 7.2 cm⁻¹ as an instrument-limited estimate, not a precision crystallinity measurement.</w:t>
+      </w:r>
+    </w:p>
+    <w:p>
+      <w:pPr>
+        <w:spacing w:after="160"/>
+        <w:ind w:left="360"/>
+      </w:pPr>
+      <w:r>
+        <w:rPr>
+          <w:i/>
+          <w:color w:val="555555"/>
+          <w:sz w:val="19"/>
+        </w:rPr>
+        <w:t>Still useful as a baseline: if a future measurement on the same instrument gives a much broader Si peak, that's worth investigating (could indicate amorphization/disorder from etching) — but the comparison should be relative to this ~7 cm-1 figure, not to the literature ~3-5 cm-1 figure.</w:t>
+      </w:r>
+    </w:p>
+    <w:p>
+      <w:pPr>
+        <w:pStyle w:val="Heading2"/>
+      </w:pPr>
+      <w:r>
+        <w:t>5.2  Signal linearity and SNR scaling</w:t>
+      </w:r>
+    </w:p>
+    <w:tbl>
+      <w:tblPr>
+        <w:tblStyle w:val="TableGrid"/>
+        <w:tblW w:type="auto" w:w="0"/>
+        <w:jc w:val="center"/>
+        <w:tblLayout w:type="autofit"/>
+        <w:tblLook w:firstColumn="1" w:firstRow="1" w:lastColumn="0" w:lastRow="0" w:noHBand="0" w:noVBand="1" w:val="04A0"/>
+      </w:tblPr>
+      <w:tblGrid>
+        <w:gridCol w:w="3250"/>
+        <w:gridCol w:w="3250"/>
+        <w:gridCol w:w="3250"/>
+      </w:tblGrid>
+      <w:tr>
+        <w:tc>
+          <w:tcPr>
+            <w:tcW w:type="dxa" w:w="1152"/>
+            <w:shd w:val="clear" w:fill="2E5A5E"/>
+          </w:tcPr>
+          <w:p>
+            <w:r/>
+            <w:r>
+              <w:rPr>
+                <w:b/>
+                <w:color w:val="FFFFFF"/>
+                <w:sz w:val="18"/>
+              </w:rPr>
+              <w:t>Power</w:t>
+            </w:r>
+          </w:p>
+        </w:tc>
+        <w:tc>
+          <w:tcPr>
+            <w:tcW w:type="dxa" w:w="4896"/>
+            <w:shd w:val="clear" w:fill="2E5A5E"/>
+          </w:tcPr>
+          <w:p>
+            <w:r/>
+            <w:r>
+              <w:rPr>
+                <w:b/>
+                <w:color w:val="FFFFFF"/>
+                <w:sz w:val="18"/>
+              </w:rPr>
+              <w:t>Fit: height = slope×t + intercept</w:t>
+            </w:r>
+          </w:p>
+        </w:tc>
+        <w:tc>
+          <w:tcPr>
+            <w:tcW w:type="dxa" w:w="2016"/>
+            <w:shd w:val="clear" w:fill="2E5A5E"/>
+          </w:tcPr>
+          <w:p>
+            <w:r/>
+            <w:r>
+              <w:rPr>
+                <w:b/>
+                <w:color w:val="FFFFFF"/>
+                <w:sz w:val="18"/>
+              </w:rPr>
+              <w:t>R²</w:t>
+            </w:r>
+          </w:p>
+        </w:tc>
+      </w:tr>
+      <w:tr>
+        <w:tc>
+          <w:tcPr>
+            <w:tcW w:type="dxa" w:w="1152"/>
+          </w:tcPr>
+          <w:p>
+            <w:r/>
+            <w:r>
+              <w:rPr>
+                <w:sz w:val="18"/>
+              </w:rPr>
+              <w:t>P1</w:t>
+            </w:r>
+          </w:p>
+        </w:tc>
+        <w:tc>
+          <w:tcPr>
+            <w:tcW w:type="dxa" w:w="4896"/>
+          </w:tcPr>
+          <w:p>
+            <w:r/>
+            <w:r>
+              <w:rPr>
+                <w:sz w:val="18"/>
+              </w:rPr>
+              <w:t>19.6×t + 13.8</w:t>
+            </w:r>
+          </w:p>
+        </w:tc>
+        <w:tc>
+          <w:tcPr>
+            <w:tcW w:type="dxa" w:w="2016"/>
+          </w:tcPr>
+          <w:p>
+            <w:r/>
+            <w:r>
+              <w:rPr>
+                <w:sz w:val="18"/>
+              </w:rPr>
+              <w:t>0.996</w:t>
+            </w:r>
+          </w:p>
+        </w:tc>
+      </w:tr>
+      <w:tr>
+        <w:tc>
+          <w:tcPr>
+            <w:tcW w:type="dxa" w:w="1152"/>
+            <w:shd w:val="clear" w:fill="EAF1F1"/>
+          </w:tcPr>
+          <w:p>
+            <w:r/>
+            <w:r>
+              <w:rPr>
+                <w:sz w:val="18"/>
+              </w:rPr>
+              <w:t>P5</w:t>
+            </w:r>
+          </w:p>
+        </w:tc>
+        <w:tc>
+          <w:tcPr>
+            <w:tcW w:type="dxa" w:w="4896"/>
+            <w:shd w:val="clear" w:fill="EAF1F1"/>
+          </w:tcPr>
+          <w:p>
+            <w:r/>
+            <w:r>
+              <w:rPr>
+                <w:sz w:val="18"/>
+              </w:rPr>
+              <w:t>43.2×t − 68.6</w:t>
+            </w:r>
+          </w:p>
+        </w:tc>
+        <w:tc>
+          <w:tcPr>
+            <w:tcW w:type="dxa" w:w="2016"/>
+            <w:shd w:val="clear" w:fill="EAF1F1"/>
+          </w:tcPr>
+          <w:p>
+            <w:r/>
+            <w:r>
+              <w:rPr>
+                <w:sz w:val="18"/>
+              </w:rPr>
+              <w:t>0.970</w:t>
+            </w:r>
+          </w:p>
+        </w:tc>
+      </w:tr>
+      <w:tr>
+        <w:tc>
+          <w:tcPr>
+            <w:tcW w:type="dxa" w:w="1152"/>
+          </w:tcPr>
+          <w:p>
+            <w:r/>
+            <w:r>
+              <w:rPr>
+                <w:sz w:val="18"/>
+              </w:rPr>
+              <w:t>P10</w:t>
+            </w:r>
+          </w:p>
+        </w:tc>
+        <w:tc>
+          <w:tcPr>
+            <w:tcW w:type="dxa" w:w="4896"/>
+          </w:tcPr>
+          <w:p>
+            <w:r/>
+            <w:r>
+              <w:rPr>
+                <w:sz w:val="18"/>
+              </w:rPr>
+              <w:t>65.8×t − 64.1</w:t>
+            </w:r>
+          </w:p>
+        </w:tc>
+        <w:tc>
+          <w:tcPr>
+            <w:tcW w:type="dxa" w:w="2016"/>
+          </w:tcPr>
+          <w:p>
+            <w:r/>
+            <w:r>
+              <w:rPr>
+                <w:sz w:val="18"/>
+              </w:rPr>
+              <w:t>0.948</w:t>
+            </w:r>
+          </w:p>
+        </w:tc>
+      </w:tr>
+    </w:tbl>
+    <w:p>
+      <w:pPr>
+        <w:spacing w:after="40"/>
+      </w:pPr>
+    </w:p>
+    <w:p>
+      <w:pPr>
+        <w:spacing w:after="80"/>
+      </w:pPr>
+      <w:r>
+        <w:rPr>
+          <w:b w:val="0"/>
+          <w:i w:val="0"/>
+        </w:rPr>
+        <w:t>Peak height grows approximately linearly with integration time at all three power levels (R²=0.95-0.996), as expected for photon-counting behavior.</w:t>
+      </w:r>
+    </w:p>
+    <w:p>
+      <w:pPr>
+        <w:jc w:val="center"/>
+      </w:pPr>
+      <w:r>
+        <w:drawing>
+          <wp:inline xmlns:a="http://schemas.openxmlformats.org/drawingml/2006/main" xmlns:pic="http://schemas.openxmlformats.org/drawingml/2006/picture">
+            <wp:extent cx="5669280" cy="2267712"/>
+            <wp:docPr id="5" name="Picture 5"/>
+            <wp:cNvGraphicFramePr>
+              <a:graphicFrameLocks noChangeAspect="1"/>
+            </wp:cNvGraphicFramePr>
+            <a:graphic>
+              <a:graphicData uri="http://schemas.openxmlformats.org/drawingml/2006/picture">
+                <pic:pic>
+                  <pic:nvPicPr>
+                    <pic:cNvPr id="0" name="rawsi_linearity_check.png"/>
+                    <pic:cNvPicPr/>
+                  </pic:nvPicPr>
+                  <pic:blipFill>
+                    <a:blip r:embed="rId13"/>
+                    <a:stretch>
+                      <a:fillRect/>
+                    </a:stretch>
+                  </pic:blipFill>
+                  <pic:spPr>
+                    <a:xfrm>
+                      <a:off x="0" y="0"/>
+                      <a:ext cx="5669280" cy="2267712"/>
+                    </a:xfrm>
+                    <a:prstGeom prst="rect"/>
+                  </pic:spPr>
+                </pic:pic>
+              </a:graphicData>
+            </a:graphic>
+          </wp:inline>
+        </w:drawing>
+      </w:r>
+    </w:p>
+    <w:p>
+      <w:pPr>
+        <w:spacing w:after="160"/>
+        <w:ind w:left="360"/>
+      </w:pPr>
+      <w:r>
+        <w:rPr>
+          <w:i/>
+          <w:color w:val="555555"/>
+          <w:sz w:val="19"/>
+        </w:rPr>
+        <w:t>Left: peak height vs integration time (near-linear, slight upward curvature). Right: SNR vs sqrt(time) — a flat line would indicate pure shot-noise-limited behavior; instead SNR/sqrt(t) rises steadily (P5: 6.8→18.2; P10: 13.1→30.4), meaning SNR grows faster than the sqrt(t) shot-noise law predicts.</w:t>
+      </w:r>
+    </w:p>
+    <w:p>
+      <w:pPr>
+        <w:spacing w:after="80"/>
+      </w:pPr>
+      <w:r>
+        <w:rPr>
+          <w:b w:val="0"/>
+          <w:i w:val="0"/>
+        </w:rPr>
+        <w:t>Practical takeaway: in this system, pushing integration time up buys more SNR than a naive sqrt-law estimate would suggest (P5 went from SNR 15.3 at 5s to SNR 91.0 at 25s — a 5.9x gain for a 5x time increase, not the 2.2x a pure shot-noise system would give). This is worth remembering when NAM's signal is weak and integration time is being considered as a lever — longer integration is comparatively more efficient here than shot-noise alone would predict, likely because a roughly fixed background/read-noise floor, not pure photon shot noise, dominates the noise budget at these signal levels.</w:t>
+      </w:r>
+    </w:p>
+    <w:p>
+      <w:pPr>
+        <w:pStyle w:val="Heading2"/>
+      </w:pPr>
+      <w:r>
+        <w:t>5.3  Second-order Si bands — mostly not resolved at these settings</w:t>
+      </w:r>
+    </w:p>
+    <w:tbl>
+      <w:tblPr>
+        <w:tblStyle w:val="TableGrid"/>
+        <w:tblW w:type="auto" w:w="0"/>
+        <w:jc w:val="center"/>
+        <w:tblLayout w:type="autofit"/>
+        <w:tblLook w:firstColumn="1" w:firstRow="1" w:lastColumn="0" w:lastRow="0" w:noHBand="0" w:noVBand="1" w:val="04A0"/>
+      </w:tblPr>
+      <w:tblGrid>
+        <w:gridCol w:w="1950"/>
+        <w:gridCol w:w="1950"/>
+        <w:gridCol w:w="1950"/>
+        <w:gridCol w:w="1950"/>
+        <w:gridCol w:w="1950"/>
+      </w:tblGrid>
+      <w:tr>
+        <w:tc>
+          <w:tcPr>
+            <w:tcW w:type="dxa" w:w="2016"/>
+            <w:shd w:val="clear" w:fill="2E5A5E"/>
+          </w:tcPr>
+          <w:p>
+            <w:r/>
+            <w:r>
+              <w:rPr>
+                <w:b/>
+                <w:color w:val="FFFFFF"/>
+                <w:sz w:val="18"/>
+              </w:rPr>
+              <w:t>Approx. position</w:t>
+            </w:r>
+          </w:p>
+        </w:tc>
+        <w:tc>
+          <w:tcPr>
+            <w:tcW w:type="dxa" w:w="1872"/>
+            <w:shd w:val="clear" w:fill="2E5A5E"/>
+          </w:tcPr>
+          <w:p>
+            <w:r/>
+            <w:r>
+              <w:rPr>
+                <w:b/>
+                <w:color w:val="FFFFFF"/>
+                <w:sz w:val="18"/>
+              </w:rPr>
+              <w:t>Found at</w:t>
+            </w:r>
+          </w:p>
+        </w:tc>
+        <w:tc>
+          <w:tcPr>
+            <w:tcW w:type="dxa" w:w="1440"/>
+            <w:shd w:val="clear" w:fill="2E5A5E"/>
+          </w:tcPr>
+          <w:p>
+            <w:r/>
+            <w:r>
+              <w:rPr>
+                <w:b/>
+                <w:color w:val="FFFFFF"/>
+                <w:sz w:val="18"/>
+              </w:rPr>
+              <w:t>Height</w:t>
+            </w:r>
+          </w:p>
+        </w:tc>
+        <w:tc>
+          <w:tcPr>
+            <w:tcW w:type="dxa" w:w="1296"/>
+            <w:shd w:val="clear" w:fill="2E5A5E"/>
+          </w:tcPr>
+          <w:p>
+            <w:r/>
+            <w:r>
+              <w:rPr>
+                <w:b/>
+                <w:color w:val="FFFFFF"/>
+                <w:sz w:val="18"/>
+              </w:rPr>
+              <w:t>SNR</w:t>
+            </w:r>
+          </w:p>
+        </w:tc>
+        <w:tc>
+          <w:tcPr>
+            <w:tcW w:type="dxa" w:w="2736"/>
+            <w:shd w:val="clear" w:fill="2E5A5E"/>
+          </w:tcPr>
+          <w:p>
+            <w:r/>
+            <w:r>
+              <w:rPr>
+                <w:b/>
+                <w:color w:val="FFFFFF"/>
+                <w:sz w:val="18"/>
+              </w:rPr>
+              <w:t>Verdict</w:t>
+            </w:r>
+          </w:p>
+        </w:tc>
+      </w:tr>
+      <w:tr>
+        <w:tc>
+          <w:tcPr>
+            <w:tcW w:type="dxa" w:w="2016"/>
+          </w:tcPr>
+          <w:p>
+            <w:r/>
+            <w:r>
+              <w:rPr>
+                <w:sz w:val="18"/>
+              </w:rPr>
+              <w:t>~300 cm⁻¹</w:t>
+            </w:r>
+          </w:p>
+        </w:tc>
+        <w:tc>
+          <w:tcPr>
+            <w:tcW w:type="dxa" w:w="1872"/>
+          </w:tcPr>
+          <w:p>
+            <w:r/>
+            <w:r>
+              <w:rPr>
+                <w:sz w:val="18"/>
+              </w:rPr>
+              <w:t>305.0 cm⁻¹</w:t>
+            </w:r>
+          </w:p>
+        </w:tc>
+        <w:tc>
+          <w:tcPr>
+            <w:tcW w:type="dxa" w:w="1440"/>
+          </w:tcPr>
+          <w:p>
+            <w:r/>
+            <w:r>
+              <w:rPr>
+                <w:sz w:val="18"/>
+              </w:rPr>
+              <w:t>52.1</w:t>
+            </w:r>
+          </w:p>
+        </w:tc>
+        <w:tc>
+          <w:tcPr>
+            <w:tcW w:type="dxa" w:w="1296"/>
+          </w:tcPr>
+          <w:p>
+            <w:r/>
+            <w:r>
+              <w:rPr>
+                <w:sz w:val="18"/>
+              </w:rPr>
+              <w:t>4.6</w:t>
+            </w:r>
+          </w:p>
+        </w:tc>
+        <w:tc>
+          <w:tcPr>
+            <w:tcW w:type="dxa" w:w="2736"/>
+          </w:tcPr>
+          <w:p>
+            <w:r/>
+            <w:r>
+              <w:rPr>
+                <w:sz w:val="18"/>
+              </w:rPr>
+              <w:t>Marginally visible</w:t>
+            </w:r>
+          </w:p>
+        </w:tc>
+      </w:tr>
+      <w:tr>
+        <w:tc>
+          <w:tcPr>
+            <w:tcW w:type="dxa" w:w="2016"/>
+            <w:shd w:val="clear" w:fill="EAF1F1"/>
+          </w:tcPr>
+          <w:p>
+            <w:r/>
+            <w:r>
+              <w:rPr>
+                <w:sz w:val="18"/>
+              </w:rPr>
+              <w:t>~620 cm⁻¹</w:t>
+            </w:r>
+          </w:p>
+        </w:tc>
+        <w:tc>
+          <w:tcPr>
+            <w:tcW w:type="dxa" w:w="1872"/>
+            <w:shd w:val="clear" w:fill="EAF1F1"/>
+          </w:tcPr>
+          <w:p>
+            <w:r/>
+            <w:r>
+              <w:rPr>
+                <w:sz w:val="18"/>
+              </w:rPr>
+              <w:t>606.6 cm⁻¹</w:t>
+            </w:r>
+          </w:p>
+        </w:tc>
+        <w:tc>
+          <w:tcPr>
+            <w:tcW w:type="dxa" w:w="1440"/>
+            <w:shd w:val="clear" w:fill="EAF1F1"/>
+          </w:tcPr>
+          <w:p>
+            <w:r/>
+            <w:r>
+              <w:rPr>
+                <w:sz w:val="18"/>
+              </w:rPr>
+              <w:t>21.1</w:t>
+            </w:r>
+          </w:p>
+        </w:tc>
+        <w:tc>
+          <w:tcPr>
+            <w:tcW w:type="dxa" w:w="1296"/>
+            <w:shd w:val="clear" w:fill="EAF1F1"/>
+          </w:tcPr>
+          <w:p>
+            <w:r/>
+            <w:r>
+              <w:rPr>
+                <w:sz w:val="18"/>
+              </w:rPr>
+              <w:t>1.9</w:t>
+            </w:r>
+          </w:p>
+        </w:tc>
+        <w:tc>
+          <w:tcPr>
+            <w:tcW w:type="dxa" w:w="2736"/>
+            <w:shd w:val="clear" w:fill="EAF1F1"/>
+          </w:tcPr>
+          <w:p>
+            <w:r/>
+            <w:r>
+              <w:rPr>
+                <w:sz w:val="18"/>
+              </w:rPr>
+              <w:t>Not resolved</w:t>
+            </w:r>
+          </w:p>
+        </w:tc>
+      </w:tr>
+      <w:tr>
+        <w:tc>
+          <w:tcPr>
+            <w:tcW w:type="dxa" w:w="2016"/>
+          </w:tcPr>
+          <w:p>
+            <w:r/>
+            <w:r>
+              <w:rPr>
+                <w:sz w:val="18"/>
+              </w:rPr>
+              <w:t>~970 cm⁻¹</w:t>
+            </w:r>
+          </w:p>
+        </w:tc>
+        <w:tc>
+          <w:tcPr>
+            <w:tcW w:type="dxa" w:w="1872"/>
+          </w:tcPr>
+          <w:p>
+            <w:r/>
+            <w:r>
+              <w:rPr>
+                <w:sz w:val="18"/>
+              </w:rPr>
+              <w:t>955.9 cm⁻¹</w:t>
+            </w:r>
+          </w:p>
+        </w:tc>
+        <w:tc>
+          <w:tcPr>
+            <w:tcW w:type="dxa" w:w="1440"/>
+          </w:tcPr>
+          <w:p>
+            <w:r/>
+            <w:r>
+              <w:rPr>
+                <w:sz w:val="18"/>
+              </w:rPr>
+              <w:t>20.7</w:t>
+            </w:r>
+          </w:p>
+        </w:tc>
+        <w:tc>
+          <w:tcPr>
+            <w:tcW w:type="dxa" w:w="1296"/>
+          </w:tcPr>
+          <w:p>
+            <w:r/>
+            <w:r>
+              <w:rPr>
+                <w:sz w:val="18"/>
+              </w:rPr>
+              <w:t>1.8</w:t>
+            </w:r>
+          </w:p>
+        </w:tc>
+        <w:tc>
+          <w:tcPr>
+            <w:tcW w:type="dxa" w:w="2736"/>
+          </w:tcPr>
+          <w:p>
+            <w:r/>
+            <w:r>
+              <w:rPr>
+                <w:sz w:val="18"/>
+              </w:rPr>
+              <w:t>Not resolved</w:t>
+            </w:r>
+          </w:p>
+        </w:tc>
+      </w:tr>
+      <w:tr>
+        <w:tc>
+          <w:tcPr>
+            <w:tcW w:type="dxa" w:w="2016"/>
+            <w:shd w:val="clear" w:fill="EAF1F1"/>
+          </w:tcPr>
+          <w:p>
+            <w:r/>
+            <w:r>
+              <w:rPr>
+                <w:sz w:val="18"/>
+              </w:rPr>
+              <w:t>~1450 cm⁻¹</w:t>
+            </w:r>
+          </w:p>
+        </w:tc>
+        <w:tc>
+          <w:tcPr>
+            <w:tcW w:type="dxa" w:w="1872"/>
+            <w:shd w:val="clear" w:fill="EAF1F1"/>
+          </w:tcPr>
+          <w:p>
+            <w:r/>
+            <w:r>
+              <w:rPr>
+                <w:sz w:val="18"/>
+              </w:rPr>
+              <w:t>1444.5 cm⁻¹</w:t>
+            </w:r>
+          </w:p>
+        </w:tc>
+        <w:tc>
+          <w:tcPr>
+            <w:tcW w:type="dxa" w:w="1440"/>
+            <w:shd w:val="clear" w:fill="EAF1F1"/>
+          </w:tcPr>
+          <w:p>
+            <w:r/>
+            <w:r>
+              <w:rPr>
+                <w:sz w:val="18"/>
+              </w:rPr>
+              <w:t>24.9</w:t>
+            </w:r>
+          </w:p>
+        </w:tc>
+        <w:tc>
+          <w:tcPr>
+            <w:tcW w:type="dxa" w:w="1296"/>
+            <w:shd w:val="clear" w:fill="EAF1F1"/>
+          </w:tcPr>
+          <w:p>
+            <w:r/>
+            <w:r>
+              <w:rPr>
+                <w:sz w:val="18"/>
+              </w:rPr>
+              <w:t>2.2</w:t>
+            </w:r>
+          </w:p>
+        </w:tc>
+        <w:tc>
+          <w:tcPr>
+            <w:tcW w:type="dxa" w:w="2736"/>
+            <w:shd w:val="clear" w:fill="EAF1F1"/>
+          </w:tcPr>
+          <w:p>
+            <w:r/>
+            <w:r>
+              <w:rPr>
+                <w:sz w:val="18"/>
+              </w:rPr>
+              <w:t>Not resolved</w:t>
+            </w:r>
+          </w:p>
+        </w:tc>
+      </w:tr>
+    </w:tbl>
+    <w:p>
+      <w:pPr>
+        <w:spacing w:after="40"/>
+      </w:pPr>
+    </w:p>
+    <w:p>
+      <w:pPr>
+        <w:spacing w:after="80"/>
+      </w:pPr>
+      <w:r>
+        <w:rPr>
+          <w:b w:val="0"/>
+          <w:i w:val="0"/>
+        </w:rPr>
+        <w:t>Silicon has several much weaker second-order/combination Raman bands beyond the dominant TO phonon. Only the ~300 cm⁻¹ region shows a marginal, borderline signal (SNR 4.6) at the best (P10/25s) condition; the others don't clear a meaningful threshold. This is expected — these bands are intrinsically far weaker than the first-order peak — and isn't a data quality concern.</w:t>
+      </w:r>
+    </w:p>
+    <w:p>
+      <w:pPr>
+        <w:pStyle w:val="Heading2"/>
+      </w:pPr>
+      <w:r>
+        <w:t>5.4  Data-quality note: very low wavenumber region</w:t>
+      </w:r>
+    </w:p>
+    <w:tbl>
+      <w:tblPr>
+        <w:tblStyle w:val="TableGrid"/>
+        <w:tblW w:type="auto" w:w="0"/>
+        <w:tblLook w:firstColumn="1" w:firstRow="1" w:lastColumn="0" w:lastRow="0" w:noHBand="0" w:noVBand="1" w:val="04A0"/>
+      </w:tblPr>
+      <w:tblGrid>
+        <w:gridCol w:w="9749"/>
+      </w:tblGrid>
+      <w:tr>
+        <w:tc>
+          <w:tcPr>
+            <w:tcW w:type="dxa" w:w="9749"/>
+            <w:shd w:val="clear" w:fill="FBE2E2"/>
+          </w:tcPr>
+          <w:p>
+            <w:r/>
+            <w:r>
+              <w:rPr>
+                <w:b/>
+                <w:color w:val="8A0000"/>
+                <w:sz w:val="19"/>
+              </w:rPr>
+              <w:t>NOTE — The full acquisition range (down to -46 cm-1) contains two very intense features below ~50 cm-1 — far taller than the genuine Si peak (roughly 5-6x higher counts). These are almost certainly instrumental: residual/leaked laser (Rayleigh) line and a filter-edge artifact, not real Raman signal. All analysis in this project (both this report and the 12 Aug NAM/R6G work) already restricts to ≥400 cm-1, which safely avoids this region — but flagging it explicitly here so this artifact isn't mistaken for a real peak if anyone examines the raw files' full range directly in the future.</w:t>
+            </w:r>
+          </w:p>
+        </w:tc>
+      </w:tr>
+    </w:tbl>
+    <w:p>
+      <w:pPr>
+        <w:spacing w:after="80"/>
+      </w:pPr>
+    </w:p>
+    <w:p>
+      <w:pPr>
+        <w:jc w:val="center"/>
+      </w:pPr>
+      <w:r>
+        <w:drawing>
+          <wp:inline xmlns:a="http://schemas.openxmlformats.org/drawingml/2006/main" xmlns:pic="http://schemas.openxmlformats.org/drawingml/2006/picture">
+            <wp:extent cx="5486400" cy="2438400"/>
+            <wp:docPr id="6" name="Picture 6"/>
+            <wp:cNvGraphicFramePr>
+              <a:graphicFrameLocks noChangeAspect="1"/>
+            </wp:cNvGraphicFramePr>
+            <a:graphic>
+              <a:graphicData uri="http://schemas.openxmlformats.org/drawingml/2006/picture">
+                <pic:pic>
+                  <pic:nvPicPr>
+                    <pic:cNvPr id="0" name="rawsi_fullrange.png"/>
+                    <pic:cNvPicPr/>
+                  </pic:nvPicPr>
+                  <pic:blipFill>
+                    <a:blip r:embed="rId14"/>
+                    <a:stretch>
+                      <a:fillRect/>
+                    </a:stretch>
+                  </pic:blipFill>
+                  <pic:spPr>
+                    <a:xfrm>
+                      <a:off x="0" y="0"/>
+                      <a:ext cx="5486400" cy="2438400"/>
+                    </a:xfrm>
+                    <a:prstGeom prst="rect"/>
+                  </pic:spPr>
+                </pic:pic>
+              </a:graphicData>
+            </a:graphic>
+          </wp:inline>
+        </w:drawing>
+      </w:r>
+    </w:p>
+    <w:p>
+      <w:pPr>
+        <w:spacing w:after="160"/>
+        <w:ind w:left="360"/>
+      </w:pPr>
+      <w:r>
+        <w:rPr>
+          <w:i/>
+          <w:color w:val="555555"/>
+          <w:sz w:val="19"/>
+        </w:rPr>
+        <w:t>Full acquired range (P10/25s). The two large peaks below ~50 cm-1 are instrumental artifacts, not Si Raman signal — genuine Si TO phonon (518 cm-1) is the third, much smaller peak.</w:t>
+      </w:r>
+    </w:p>
     <w:sectPr>
       <w:pgSz w:w="11909" w:h="16834"/>
       <w:pgMar w:top="1080" w:right="1080" w:bottom="1080" w:left="1080" w:header="720" w:footer="720" w:gutter="0"/>

</xml_diff>